<commit_message>
Uppdatera CLAUDE.md med en ny regel som föreslår tre olika upplägg innan längre texter skrivs. Tillägget syftar till att förbättra arbetsflödet och minska kostnaderna för omarbetning av texter. Justera även källförteckningen i Humanizer_promt.docx med nya referenser för att stärka dokumentationen kring humanizer-färdigheten.
</commit_message>
<xml_diff>
--- a/Humanizer_promt.docx
+++ b/Humanizer_promt.docx
@@ -1416,21 +1416,7 @@
         <w:rPr>
           <w:lang w:val="en-US"/>
         </w:rPr>
-        <w:t xml:space="preserve"> Industry reports, Observers have cited, Experts argue, </w:t>
-      </w:r>
-      <w:proofErr w:type="gramStart"/>
-      <w:r>
-        <w:rPr>
-          <w:lang w:val="en-US"/>
-        </w:rPr>
-        <w:t>Some</w:t>
-      </w:r>
-      <w:proofErr w:type="gramEnd"/>
-      <w:r>
-        <w:rPr>
-          <w:lang w:val="en-US"/>
-        </w:rPr>
-        <w:t xml:space="preserve"> critics argue, several sources/publications (when few cited)</w:t>
+        <w:t> Industry reports, Observers have cited, Experts argue, Some critics argue, several sources/publications (when few cited)</w:t>
       </w:r>
     </w:p>
     <w:p>
@@ -3079,25 +3065,7 @@
           <w:bCs/>
           <w:lang w:val="en-US"/>
         </w:rPr>
-        <w:t xml:space="preserve">Strategic Negotiations </w:t>
-      </w:r>
-      <w:proofErr w:type="gramStart"/>
-      <w:r>
-        <w:rPr>
-          <w:b/>
-          <w:bCs/>
-          <w:lang w:val="en-US"/>
-        </w:rPr>
-        <w:t>And</w:t>
-      </w:r>
-      <w:proofErr w:type="gramEnd"/>
-      <w:r>
-        <w:rPr>
-          <w:b/>
-          <w:bCs/>
-          <w:lang w:val="en-US"/>
-        </w:rPr>
-        <w:t xml:space="preserve"> Global Partnerships</w:t>
+        <w:t>Strategic Negotiations And Global Partnerships</w:t>
       </w:r>
     </w:p>
     <w:p>
@@ -3447,49 +3415,7 @@
         <w:rPr>
           <w:lang w:val="en-US"/>
         </w:rPr>
-        <w:t xml:space="preserve"> I hope this helps, Of </w:t>
-      </w:r>
-      <w:proofErr w:type="gramStart"/>
-      <w:r>
-        <w:rPr>
-          <w:lang w:val="en-US"/>
-        </w:rPr>
-        <w:t>course!,</w:t>
-      </w:r>
-      <w:proofErr w:type="gramEnd"/>
-      <w:r>
-        <w:rPr>
-          <w:lang w:val="en-US"/>
-        </w:rPr>
-        <w:t xml:space="preserve"> </w:t>
-      </w:r>
-      <w:proofErr w:type="gramStart"/>
-      <w:r>
-        <w:rPr>
-          <w:lang w:val="en-US"/>
-        </w:rPr>
-        <w:t>Certainly!,</w:t>
-      </w:r>
-      <w:proofErr w:type="gramEnd"/>
-      <w:r>
-        <w:rPr>
-          <w:lang w:val="en-US"/>
-        </w:rPr>
-        <w:t xml:space="preserve"> You're absolutely </w:t>
-      </w:r>
-      <w:proofErr w:type="gramStart"/>
-      <w:r>
-        <w:rPr>
-          <w:lang w:val="en-US"/>
-        </w:rPr>
-        <w:t>right!,</w:t>
-      </w:r>
-      <w:proofErr w:type="gramEnd"/>
-      <w:r>
-        <w:rPr>
-          <w:lang w:val="en-US"/>
-        </w:rPr>
-        <w:t xml:space="preserve"> Would you like..., let me know, here is a...</w:t>
+        <w:t> I hope this helps, Of course!, Certainly!, You're absolutely right!, Would you like..., let me know, here is a...</w:t>
       </w:r>
     </w:p>
     <w:p>
@@ -3604,35 +3530,7 @@
         <w:rPr>
           <w:lang w:val="en-US"/>
         </w:rPr>
-        <w:t xml:space="preserve"> as of [date], </w:t>
-      </w:r>
-      <w:proofErr w:type="gramStart"/>
-      <w:r>
-        <w:rPr>
-          <w:lang w:val="en-US"/>
-        </w:rPr>
-        <w:t>Up</w:t>
-      </w:r>
-      <w:proofErr w:type="gramEnd"/>
-      <w:r>
-        <w:rPr>
-          <w:lang w:val="en-US"/>
-        </w:rPr>
-        <w:t xml:space="preserve"> to my last training update, </w:t>
-      </w:r>
-      <w:proofErr w:type="gramStart"/>
-      <w:r>
-        <w:rPr>
-          <w:lang w:val="en-US"/>
-        </w:rPr>
-        <w:t>While</w:t>
-      </w:r>
-      <w:proofErr w:type="gramEnd"/>
-      <w:r>
-        <w:rPr>
-          <w:lang w:val="en-US"/>
-        </w:rPr>
-        <w:t xml:space="preserve"> specific details are limited/scarce..., based on available information, not publicly available, maintains a low profile, keeps personal details private, prefers to stay out of the spotlight, likely [grew up/studied/began], it is believed that</w:t>
+        <w:t> as of [date], Up to my last training update, While specific details are limited/scarce..., based on available information, not publicly available, maintains a low profile, keeps personal details private, prefers to stay out of the spotlight, likely [grew up/studied/began], it is believed that</w:t>
       </w:r>
     </w:p>
     <w:p>
@@ -4831,21 +4729,7 @@
         <w:rPr>
           <w:lang w:val="en-US"/>
         </w:rPr>
-        <w:t xml:space="preserve">This function uses a hash map for </w:t>
-      </w:r>
-      <w:proofErr w:type="gramStart"/>
-      <w:r>
-        <w:rPr>
-          <w:lang w:val="en-US"/>
-        </w:rPr>
-        <w:t>O(</w:t>
-      </w:r>
-      <w:proofErr w:type="gramEnd"/>
-      <w:r>
-        <w:rPr>
-          <w:lang w:val="en-US"/>
-        </w:rPr>
-        <w:t>1) lookups, avoiding the O(n²) cost of naive iteration.</w:t>
+        <w:t>This function uses a hash map for O(1) lookups, avoiding the O(n²) cost of naive iteration.</w:t>
       </w:r>
     </w:p>
     <w:p>
@@ -5201,15 +5085,7 @@
       </w:r>
       <w:proofErr w:type="spellEnd"/>
       <w:r>
-        <w:t> </w:t>
-      </w:r>
-      <w:proofErr w:type="gramStart"/>
-      <w:r>
-        <w:t>is not</w:t>
-      </w:r>
-      <w:proofErr w:type="gramEnd"/>
-      <w:r>
-        <w:t xml:space="preserve"> a </w:t>
+        <w:t xml:space="preserve"> is not a </w:t>
       </w:r>
       <w:proofErr w:type="spellStart"/>
       <w:r>
@@ -5524,13 +5400,8 @@
         </w:rPr>
         <w:t xml:space="preserve"> A real address. A weird quote. The phrase "the lawyer who used to work upstairs from my dentist." </w:t>
       </w:r>
-      <w:proofErr w:type="gramStart"/>
-      <w:r>
-        <w:t>LLMs</w:t>
-      </w:r>
-      <w:proofErr w:type="gramEnd"/>
-      <w:r>
-        <w:t xml:space="preserve"> round off </w:t>
+      <w:r>
+        <w:t xml:space="preserve">LLMs round off </w:t>
       </w:r>
       <w:proofErr w:type="spellStart"/>
       <w:r>
@@ -5578,13 +5449,8 @@
         </w:rPr>
         <w:t xml:space="preserve"> "I think this is mostly good, but it bothers me, and I can't fully explain why." </w:t>
       </w:r>
-      <w:proofErr w:type="gramStart"/>
-      <w:r>
-        <w:t>LLMs</w:t>
-      </w:r>
-      <w:proofErr w:type="gramEnd"/>
-      <w:r>
-        <w:t xml:space="preserve"> default to </w:t>
+      <w:r>
+        <w:t xml:space="preserve">LLMs default to </w:t>
       </w:r>
       <w:proofErr w:type="spellStart"/>
       <w:r>
@@ -5624,13 +5490,8 @@
         </w:rPr>
         <w:t xml:space="preserve"> Slang, memes, or in-jokes that map to a specific year and subculture. </w:t>
       </w:r>
-      <w:proofErr w:type="spellStart"/>
-      <w:r>
-        <w:t>Models</w:t>
-      </w:r>
-      <w:proofErr w:type="spellEnd"/>
-      <w:r>
-        <w:t xml:space="preserve"> lag by a </w:t>
+      <w:r>
+        <w:t xml:space="preserve">Models lag by a </w:t>
       </w:r>
       <w:proofErr w:type="spellStart"/>
       <w:r>
@@ -5782,13 +5643,8 @@
         </w:rPr>
         <w:t xml:space="preserve"> "(I keep wanting to say 'almost' here, but it really was certain.)" </w:t>
       </w:r>
-      <w:proofErr w:type="spellStart"/>
-      <w:r>
-        <w:t>Models</w:t>
-      </w:r>
-      <w:proofErr w:type="spellEnd"/>
-      <w:r>
-        <w:t xml:space="preserve"> </w:t>
+      <w:r>
+        <w:t xml:space="preserve">Models </w:t>
       </w:r>
       <w:proofErr w:type="spellStart"/>
       <w:r>
@@ -5851,7 +5707,7 @@
     <w:p>
       <w:r>
         <w:pict w14:anchorId="197F1495">
-          <v:rect id="_x0000_i1031" style="width:0;height:3pt" o:hralign="center" o:hrstd="t" o:hr="t" fillcolor="#a0a0a0" stroked="f"/>
+          <v:rect id="_x0000_i1025" style="width:0;height:3pt" o:hralign="center" o:hrstd="t" o:hr="t" fillcolor="#a0a0a0" stroked="f"/>
         </w:pict>
       </w:r>
     </w:p>
@@ -6433,35 +6289,22 @@
       </w:r>
     </w:p>
     <w:p>
+      <w:pPr>
+        <w:rPr>
+          <w:lang w:val="en-US"/>
+        </w:rPr>
+      </w:pPr>
       <w:r>
         <w:rPr>
           <w:lang w:val="en-US"/>
         </w:rPr>
         <w:t xml:space="preserve">People I talk to tend to land in two camps. Some use it like autocomplete for chores and review every line. Others disable it after it keeps suggesting patterns they don't want. </w:t>
       </w:r>
-      <w:proofErr w:type="spellStart"/>
-      <w:r>
-        <w:t>Both</w:t>
-      </w:r>
-      <w:proofErr w:type="spellEnd"/>
-      <w:r>
-        <w:t xml:space="preserve"> </w:t>
-      </w:r>
-      <w:proofErr w:type="spellStart"/>
-      <w:r>
-        <w:t>feel</w:t>
-      </w:r>
-      <w:proofErr w:type="spellEnd"/>
-      <w:r>
-        <w:t xml:space="preserve"> </w:t>
-      </w:r>
-      <w:proofErr w:type="spellStart"/>
-      <w:r>
-        <w:t>reasonable</w:t>
-      </w:r>
-      <w:proofErr w:type="spellEnd"/>
-      <w:r>
-        <w:t>.</w:t>
+      <w:r>
+        <w:rPr>
+          <w:lang w:val="en-US"/>
+        </w:rPr>
+        <w:t>Both feel reasonable.</w:t>
       </w:r>
     </w:p>
     <w:p>
@@ -6569,7 +6412,6 @@
       <w:r>
         <w:fldChar w:fldCharType="separate"/>
       </w:r>
-      <w:proofErr w:type="gramStart"/>
       <w:r>
         <w:rPr>
           <w:rStyle w:val="Hyperlnk"/>
@@ -6578,7 +6420,6 @@
         <w:t>Wikipedia:Signs</w:t>
       </w:r>
       <w:proofErr w:type="spellEnd"/>
-      <w:proofErr w:type="gramEnd"/>
       <w:r>
         <w:rPr>
           <w:rStyle w:val="Hyperlnk"/>
@@ -6627,7 +6468,7 @@
       <w:r>
         <w:t xml:space="preserve">Källa: </w:t>
       </w:r>
-      <w:hyperlink r:id="rId5" w:history="1">
+      <w:hyperlink r:id="rId7" w:history="1">
         <w:r>
           <w:rPr>
             <w:rStyle w:val="Hyperlnk"/>
@@ -6638,8 +6479,204 @@
       <w:r>
         <w:t xml:space="preserve"> </w:t>
       </w:r>
-    </w:p>
+      <w:r>
+        <w:br/>
+      </w:r>
+    </w:p>
+    <w:p>
+      <w:r>
+        <w:rPr>
+          <w:b/>
+          <w:bCs/>
+        </w:rPr>
+        <w:t xml:space="preserve">Källförteckning: </w:t>
+      </w:r>
+      <w:hyperlink r:id="rId8" w:history="1">
+        <w:r>
+          <w:rPr>
+            <w:rStyle w:val="Hyperlnk"/>
+          </w:rPr>
+          <w:t>https://github.com/kentlundgren/Ekonomi/blob/main/skills/humanizer_ton/humanizer_bakgrund.md</w:t>
+        </w:r>
+      </w:hyperlink>
+      <w:r>
+        <w:t xml:space="preserve"> </w:t>
+      </w:r>
+    </w:p>
+    <w:p>
+      <w:pPr>
+        <w:rPr>
+          <w:lang w:val="en-US"/>
+        </w:rPr>
+      </w:pPr>
+      <w:proofErr w:type="spellStart"/>
+      <w:r>
+        <w:rPr>
+          <w:lang w:val="en-US"/>
+        </w:rPr>
+        <w:t>aihxp</w:t>
+      </w:r>
+      <w:proofErr w:type="spellEnd"/>
+      <w:r>
+        <w:rPr>
+          <w:lang w:val="en-US"/>
+        </w:rPr>
+        <w:t xml:space="preserve"> (2026). </w:t>
+      </w:r>
+      <w:r>
+        <w:rPr>
+          <w:i/>
+          <w:iCs/>
+          <w:lang w:val="en-US"/>
+        </w:rPr>
+        <w:t>humanizer – Pure-prompt skill that de-slops AI-sounding prose</w:t>
+      </w:r>
+      <w:r>
+        <w:rPr>
+          <w:lang w:val="en-US"/>
+        </w:rPr>
+        <w:t xml:space="preserve">. GitHub. </w:t>
+      </w:r>
+      <w:proofErr w:type="spellStart"/>
+      <w:r>
+        <w:rPr>
+          <w:lang w:val="en-US"/>
+        </w:rPr>
+        <w:t>Hämtad</w:t>
+      </w:r>
+      <w:proofErr w:type="spellEnd"/>
+      <w:r>
+        <w:rPr>
+          <w:lang w:val="en-US"/>
+        </w:rPr>
+        <w:t xml:space="preserve"> 2026-06-08 </w:t>
+      </w:r>
+      <w:proofErr w:type="spellStart"/>
+      <w:r>
+        <w:rPr>
+          <w:lang w:val="en-US"/>
+        </w:rPr>
+        <w:t>från</w:t>
+      </w:r>
+      <w:proofErr w:type="spellEnd"/>
+      <w:r>
+        <w:rPr>
+          <w:lang w:val="en-US"/>
+        </w:rPr>
+        <w:t> </w:t>
+      </w:r>
+      <w:hyperlink r:id="rId9" w:history="1">
+        <w:r>
+          <w:rPr>
+            <w:rStyle w:val="Hyperlnk"/>
+            <w:lang w:val="en-US"/>
+          </w:rPr>
+          <w:t>https://github.com/aihxp/humanizer</w:t>
+        </w:r>
+      </w:hyperlink>
+    </w:p>
+    <w:p>
+      <w:r>
+        <w:rPr>
+          <w:lang w:val="en-US"/>
+        </w:rPr>
+        <w:t>blader (2026). </w:t>
+      </w:r>
+      <w:r>
+        <w:rPr>
+          <w:i/>
+          <w:iCs/>
+          <w:lang w:val="en-US"/>
+        </w:rPr>
+        <w:t>Humanizer: Remove AI Writing Patterns</w:t>
+      </w:r>
+      <w:r>
+        <w:rPr>
+          <w:lang w:val="en-US"/>
+        </w:rPr>
+        <w:t xml:space="preserve"> (v 2.8.0). GitHub. </w:t>
+      </w:r>
+      <w:proofErr w:type="spellStart"/>
+      <w:r>
+        <w:rPr>
+          <w:lang w:val="en-US"/>
+        </w:rPr>
+        <w:t>Baserat</w:t>
+      </w:r>
+      <w:proofErr w:type="spellEnd"/>
+      <w:r>
+        <w:rPr>
+          <w:lang w:val="en-US"/>
+        </w:rPr>
+        <w:t xml:space="preserve"> </w:t>
+      </w:r>
+      <w:proofErr w:type="spellStart"/>
+      <w:r>
+        <w:rPr>
+          <w:lang w:val="en-US"/>
+        </w:rPr>
+        <w:t>på</w:t>
+      </w:r>
+      <w:proofErr w:type="spellEnd"/>
+      <w:r>
+        <w:rPr>
+          <w:lang w:val="en-US"/>
+        </w:rPr>
+        <w:t xml:space="preserve"> Wikipedia: Signs of AI writing. </w:t>
+      </w:r>
+      <w:r>
+        <w:t>Hämtad 2026-06-08 från </w:t>
+      </w:r>
+      <w:hyperlink r:id="rId10" w:history="1">
+        <w:r>
+          <w:rPr>
+            <w:rStyle w:val="Hyperlnk"/>
+          </w:rPr>
+          <w:t>https://github.com/blader/humanizer/blob/main/SKILL.md</w:t>
+        </w:r>
+      </w:hyperlink>
+    </w:p>
+    <w:p>
+      <w:r>
+        <w:rPr>
+          <w:lang w:val="en-US"/>
+        </w:rPr>
+        <w:t>eyesift.com (2026). </w:t>
+      </w:r>
+      <w:r>
+        <w:rPr>
+          <w:i/>
+          <w:iCs/>
+          <w:lang w:val="en-US"/>
+        </w:rPr>
+        <w:t>How to Humanize AI Text: 7 Proven Methods That Work</w:t>
+      </w:r>
+      <w:r>
+        <w:rPr>
+          <w:lang w:val="en-US"/>
+        </w:rPr>
+        <w:t xml:space="preserve">. </w:t>
+      </w:r>
+      <w:r>
+        <w:t>Hämtad 2026-06-08 från </w:t>
+      </w:r>
+      <w:hyperlink r:id="rId11" w:history="1">
+        <w:r>
+          <w:rPr>
+            <w:rStyle w:val="Hyperlnk"/>
+          </w:rPr>
+          <w:t>https://www.eyesift.com/blog/humanize-ai-text/</w:t>
+        </w:r>
+      </w:hyperlink>
+    </w:p>
+    <w:p/>
     <w:sectPr>
+      <w:headerReference w:type="even" r:id="rId12"/>
+      <w:headerReference w:type="default" r:id="rId13"/>
+      <w:footerReference w:type="even" r:id="rId14"/>
+      <w:footerReference w:type="default" r:id="rId15"/>
+      <w:headerReference w:type="first" r:id="rId16"/>
+      <w:footerReference w:type="first" r:id="rId17"/>
       <w:pgSz w:w="11906" w:h="16838"/>
       <w:pgMar w:top="1417" w:right="1417" w:bottom="1417" w:left="1417" w:header="708" w:footer="708" w:gutter="0"/>
       <w:cols w:space="708"/>
@@ -6647,6 +6684,160 @@
     </w:sectPr>
   </w:body>
 </w:document>
+</file>
+
+<file path=word/endnotes.xml><?xml version="1.0" encoding="utf-8"?>
+<w:endnotes xmlns:wpc="http://schemas.microsoft.com/office/word/2010/wordprocessingCanvas" xmlns:cx="http://schemas.microsoft.com/office/drawing/2014/chartex" xmlns:cx1="http://schemas.microsoft.com/office/drawing/2015/9/8/chartex" xmlns:cx2="http://schemas.microsoft.com/office/drawing/2015/10/21/chartex" xmlns:cx3="http://schemas.microsoft.com/office/drawing/2016/5/9/chartex" xmlns:cx4="http://schemas.microsoft.com/office/drawing/2016/5/10/chartex" xmlns:cx5="http://schemas.microsoft.com/office/drawing/2016/5/11/chartex" xmlns:cx6="http://schemas.microsoft.com/office/drawing/2016/5/12/chartex" xmlns:cx7="http://schemas.microsoft.com/office/drawing/2016/5/13/chartex" xmlns:cx8="http://schemas.microsoft.com/office/drawing/2016/5/14/chartex" xmlns:mc="http://schemas.openxmlformats.org/markup-compatibility/2006" xmlns:aink="http://schemas.microsoft.com/office/drawing/2016/ink" xmlns:am3d="http://schemas.microsoft.com/office/drawing/2017/model3d" xmlns:o="urn:schemas-microsoft-com:office:office" xmlns:oel="http://schemas.microsoft.com/office/2019/extlst" xmlns:r="http://schemas.openxmlformats.org/officeDocument/2006/relationships" xmlns:m="http://schemas.openxmlformats.org/officeDocument/2006/math" xmlns:v="urn:schemas-microsoft-com:vml" xmlns:wp14="http://schemas.microsoft.com/office/word/2010/wordprocessingDrawing" xmlns:wp="http://schemas.openxmlformats.org/drawingml/2006/wordprocessingDrawing" xmlns:w10="urn:schemas-microsoft-com:office:word" xmlns:w="http://schemas.openxmlformats.org/wordprocessingml/2006/main" xmlns:w14="http://schemas.microsoft.com/office/word/2010/wordml" xmlns:w15="http://schemas.microsoft.com/office/word/2012/wordml" xmlns:w16cex="http://schemas.microsoft.com/office/word/2018/wordml/cex" xmlns:w16cid="http://schemas.microsoft.com/office/word/2016/wordml/cid" xmlns:w16="http://schemas.microsoft.com/office/word/2018/wordml" xmlns:w16du="http://schemas.microsoft.com/office/word/2023/wordml/word16du" xmlns:w16sdtdh="http://schemas.microsoft.com/office/word/2020/wordml/sdtdatahash" xmlns:w16sdtfl="http://schemas.microsoft.com/office/word/2024/wordml/sdtformatlock" xmlns:w16se="http://schemas.microsoft.com/office/word/2015/wordml/symex" xmlns:wpg="http://schemas.microsoft.com/office/word/2010/wordprocessingGroup" xmlns:wpi="http://schemas.microsoft.com/office/word/2010/wordprocessingInk" xmlns:wne="http://schemas.microsoft.com/office/word/2006/wordml" xmlns:wps="http://schemas.microsoft.com/office/word/2010/wordprocessingShape" mc:Ignorable="w14 w15 w16se w16cid w16 w16cex w16sdtdh w16sdtfl w16du wp14">
+  <w:endnote w:type="separator" w:id="-1">
+    <w:p>
+      <w:pPr>
+        <w:spacing w:after="0" w:line="240" w:lineRule="auto"/>
+      </w:pPr>
+      <w:r>
+        <w:separator/>
+      </w:r>
+    </w:p>
+  </w:endnote>
+  <w:endnote w:type="continuationSeparator" w:id="0">
+    <w:p>
+      <w:pPr>
+        <w:spacing w:after="0" w:line="240" w:lineRule="auto"/>
+      </w:pPr>
+      <w:r>
+        <w:continuationSeparator/>
+      </w:r>
+    </w:p>
+  </w:endnote>
+</w:endnotes>
+</file>
+
+<file path=word/footer1.xml><?xml version="1.0" encoding="utf-8"?>
+<w:ftr xmlns:wpc="http://schemas.microsoft.com/office/word/2010/wordprocessingCanvas" xmlns:cx="http://schemas.microsoft.com/office/drawing/2014/chartex" xmlns:cx1="http://schemas.microsoft.com/office/drawing/2015/9/8/chartex" xmlns:cx2="http://schemas.microsoft.com/office/drawing/2015/10/21/chartex" xmlns:cx3="http://schemas.microsoft.com/office/drawing/2016/5/9/chartex" xmlns:cx4="http://schemas.microsoft.com/office/drawing/2016/5/10/chartex" xmlns:cx5="http://schemas.microsoft.com/office/drawing/2016/5/11/chartex" xmlns:cx6="http://schemas.microsoft.com/office/drawing/2016/5/12/chartex" xmlns:cx7="http://schemas.microsoft.com/office/drawing/2016/5/13/chartex" xmlns:cx8="http://schemas.microsoft.com/office/drawing/2016/5/14/chartex" xmlns:mc="http://schemas.openxmlformats.org/markup-compatibility/2006" xmlns:aink="http://schemas.microsoft.com/office/drawing/2016/ink" xmlns:am3d="http://schemas.microsoft.com/office/drawing/2017/model3d" xmlns:o="urn:schemas-microsoft-com:office:office" xmlns:oel="http://schemas.microsoft.com/office/2019/extlst" xmlns:r="http://schemas.openxmlformats.org/officeDocument/2006/relationships" xmlns:m="http://schemas.openxmlformats.org/officeDocument/2006/math" xmlns:v="urn:schemas-microsoft-com:vml" xmlns:wp14="http://schemas.microsoft.com/office/word/2010/wordprocessingDrawing" xmlns:wp="http://schemas.openxmlformats.org/drawingml/2006/wordprocessingDrawing" xmlns:w10="urn:schemas-microsoft-com:office:word" xmlns:w="http://schemas.openxmlformats.org/wordprocessingml/2006/main" xmlns:w14="http://schemas.microsoft.com/office/word/2010/wordml" xmlns:w15="http://schemas.microsoft.com/office/word/2012/wordml" xmlns:w16cex="http://schemas.microsoft.com/office/word/2018/wordml/cex" xmlns:w16cid="http://schemas.microsoft.com/office/word/2016/wordml/cid" xmlns:w16="http://schemas.microsoft.com/office/word/2018/wordml" xmlns:w16du="http://schemas.microsoft.com/office/word/2023/wordml/word16du" xmlns:w16sdtdh="http://schemas.microsoft.com/office/word/2020/wordml/sdtdatahash" xmlns:w16sdtfl="http://schemas.microsoft.com/office/word/2024/wordml/sdtformatlock" xmlns:w16se="http://schemas.microsoft.com/office/word/2015/wordml/symex" xmlns:wpg="http://schemas.microsoft.com/office/word/2010/wordprocessingGroup" xmlns:wpi="http://schemas.microsoft.com/office/word/2010/wordprocessingInk" xmlns:wne="http://schemas.microsoft.com/office/word/2006/wordml" xmlns:wps="http://schemas.microsoft.com/office/word/2010/wordprocessingShape" mc:Ignorable="w14 w15 w16se w16cid w16 w16cex w16sdtdh w16sdtfl w16du wp14">
+  <w:p>
+    <w:pPr>
+      <w:pStyle w:val="Sidfot"/>
+    </w:pPr>
+  </w:p>
+</w:ftr>
+</file>
+
+<file path=word/footer2.xml><?xml version="1.0" encoding="utf-8"?>
+<w:ftr xmlns:wpc="http://schemas.microsoft.com/office/word/2010/wordprocessingCanvas" xmlns:cx="http://schemas.microsoft.com/office/drawing/2014/chartex" xmlns:cx1="http://schemas.microsoft.com/office/drawing/2015/9/8/chartex" xmlns:cx2="http://schemas.microsoft.com/office/drawing/2015/10/21/chartex" xmlns:cx3="http://schemas.microsoft.com/office/drawing/2016/5/9/chartex" xmlns:cx4="http://schemas.microsoft.com/office/drawing/2016/5/10/chartex" xmlns:cx5="http://schemas.microsoft.com/office/drawing/2016/5/11/chartex" xmlns:cx6="http://schemas.microsoft.com/office/drawing/2016/5/12/chartex" xmlns:cx7="http://schemas.microsoft.com/office/drawing/2016/5/13/chartex" xmlns:cx8="http://schemas.microsoft.com/office/drawing/2016/5/14/chartex" xmlns:mc="http://schemas.openxmlformats.org/markup-compatibility/2006" xmlns:aink="http://schemas.microsoft.com/office/drawing/2016/ink" xmlns:am3d="http://schemas.microsoft.com/office/drawing/2017/model3d" xmlns:o="urn:schemas-microsoft-com:office:office" xmlns:oel="http://schemas.microsoft.com/office/2019/extlst" xmlns:r="http://schemas.openxmlformats.org/officeDocument/2006/relationships" xmlns:m="http://schemas.openxmlformats.org/officeDocument/2006/math" xmlns:v="urn:schemas-microsoft-com:vml" xmlns:wp14="http://schemas.microsoft.com/office/word/2010/wordprocessingDrawing" xmlns:wp="http://schemas.openxmlformats.org/drawingml/2006/wordprocessingDrawing" xmlns:w10="urn:schemas-microsoft-com:office:word" xmlns:w="http://schemas.openxmlformats.org/wordprocessingml/2006/main" xmlns:w14="http://schemas.microsoft.com/office/word/2010/wordml" xmlns:w15="http://schemas.microsoft.com/office/word/2012/wordml" xmlns:w16cex="http://schemas.microsoft.com/office/word/2018/wordml/cex" xmlns:w16cid="http://schemas.microsoft.com/office/word/2016/wordml/cid" xmlns:w16="http://schemas.microsoft.com/office/word/2018/wordml" xmlns:w16du="http://schemas.microsoft.com/office/word/2023/wordml/word16du" xmlns:w16sdtdh="http://schemas.microsoft.com/office/word/2020/wordml/sdtdatahash" xmlns:w16sdtfl="http://schemas.microsoft.com/office/word/2024/wordml/sdtformatlock" xmlns:w16se="http://schemas.microsoft.com/office/word/2015/wordml/symex" xmlns:wpg="http://schemas.microsoft.com/office/word/2010/wordprocessingGroup" xmlns:wpi="http://schemas.microsoft.com/office/word/2010/wordprocessingInk" xmlns:wne="http://schemas.microsoft.com/office/word/2006/wordml" xmlns:wps="http://schemas.microsoft.com/office/word/2010/wordprocessingShape" mc:Ignorable="w14 w15 w16se w16cid w16 w16cex w16sdtdh w16sdtfl w16du wp14">
+  <w:p>
+    <w:pPr>
+      <w:pStyle w:val="Sidfot"/>
+    </w:pPr>
+    <w:fldSimple w:instr=" FILENAME   \* MERGEFORMAT ">
+      <w:r>
+        <w:rPr>
+          <w:noProof/>
+        </w:rPr>
+        <w:t>Humanizer_promt.docx</w:t>
+      </w:r>
+    </w:fldSimple>
+    <w:r>
+      <w:tab/>
+      <w:t xml:space="preserve">sid </w:t>
+    </w:r>
+    <w:r>
+      <w:fldChar w:fldCharType="begin"/>
+    </w:r>
+    <w:r>
+      <w:instrText xml:space="preserve"> PAGE   \* MERGEFORMAT </w:instrText>
+    </w:r>
+    <w:r>
+      <w:fldChar w:fldCharType="separate"/>
+    </w:r>
+    <w:r>
+      <w:rPr>
+        <w:noProof/>
+      </w:rPr>
+      <w:t>13</w:t>
+    </w:r>
+    <w:r>
+      <w:fldChar w:fldCharType="end"/>
+    </w:r>
+    <w:r>
+      <w:t xml:space="preserve"> (</w:t>
+    </w:r>
+    <w:fldSimple w:instr=" NUMPAGES   \* MERGEFORMAT ">
+      <w:r>
+        <w:rPr>
+          <w:noProof/>
+        </w:rPr>
+        <w:t>17</w:t>
+      </w:r>
+    </w:fldSimple>
+    <w:r>
+      <w:t>)</w:t>
+    </w:r>
+  </w:p>
+</w:ftr>
+</file>
+
+<file path=word/footer3.xml><?xml version="1.0" encoding="utf-8"?>
+<w:ftr xmlns:wpc="http://schemas.microsoft.com/office/word/2010/wordprocessingCanvas" xmlns:cx="http://schemas.microsoft.com/office/drawing/2014/chartex" xmlns:cx1="http://schemas.microsoft.com/office/drawing/2015/9/8/chartex" xmlns:cx2="http://schemas.microsoft.com/office/drawing/2015/10/21/chartex" xmlns:cx3="http://schemas.microsoft.com/office/drawing/2016/5/9/chartex" xmlns:cx4="http://schemas.microsoft.com/office/drawing/2016/5/10/chartex" xmlns:cx5="http://schemas.microsoft.com/office/drawing/2016/5/11/chartex" xmlns:cx6="http://schemas.microsoft.com/office/drawing/2016/5/12/chartex" xmlns:cx7="http://schemas.microsoft.com/office/drawing/2016/5/13/chartex" xmlns:cx8="http://schemas.microsoft.com/office/drawing/2016/5/14/chartex" xmlns:mc="http://schemas.openxmlformats.org/markup-compatibility/2006" xmlns:aink="http://schemas.microsoft.com/office/drawing/2016/ink" xmlns:am3d="http://schemas.microsoft.com/office/drawing/2017/model3d" xmlns:o="urn:schemas-microsoft-com:office:office" xmlns:oel="http://schemas.microsoft.com/office/2019/extlst" xmlns:r="http://schemas.openxmlformats.org/officeDocument/2006/relationships" xmlns:m="http://schemas.openxmlformats.org/officeDocument/2006/math" xmlns:v="urn:schemas-microsoft-com:vml" xmlns:wp14="http://schemas.microsoft.com/office/word/2010/wordprocessingDrawing" xmlns:wp="http://schemas.openxmlformats.org/drawingml/2006/wordprocessingDrawing" xmlns:w10="urn:schemas-microsoft-com:office:word" xmlns:w="http://schemas.openxmlformats.org/wordprocessingml/2006/main" xmlns:w14="http://schemas.microsoft.com/office/word/2010/wordml" xmlns:w15="http://schemas.microsoft.com/office/word/2012/wordml" xmlns:w16cex="http://schemas.microsoft.com/office/word/2018/wordml/cex" xmlns:w16cid="http://schemas.microsoft.com/office/word/2016/wordml/cid" xmlns:w16="http://schemas.microsoft.com/office/word/2018/wordml" xmlns:w16du="http://schemas.microsoft.com/office/word/2023/wordml/word16du" xmlns:w16sdtdh="http://schemas.microsoft.com/office/word/2020/wordml/sdtdatahash" xmlns:w16sdtfl="http://schemas.microsoft.com/office/word/2024/wordml/sdtformatlock" xmlns:w16se="http://schemas.microsoft.com/office/word/2015/wordml/symex" xmlns:wpg="http://schemas.microsoft.com/office/word/2010/wordprocessingGroup" xmlns:wpi="http://schemas.microsoft.com/office/word/2010/wordprocessingInk" xmlns:wne="http://schemas.microsoft.com/office/word/2006/wordml" xmlns:wps="http://schemas.microsoft.com/office/word/2010/wordprocessingShape" mc:Ignorable="w14 w15 w16se w16cid w16 w16cex w16sdtdh w16sdtfl w16du wp14">
+  <w:p>
+    <w:pPr>
+      <w:pStyle w:val="Sidfot"/>
+    </w:pPr>
+  </w:p>
+</w:ftr>
+</file>
+
+<file path=word/footnotes.xml><?xml version="1.0" encoding="utf-8"?>
+<w:footnotes xmlns:wpc="http://schemas.microsoft.com/office/word/2010/wordprocessingCanvas" xmlns:cx="http://schemas.microsoft.com/office/drawing/2014/chartex" xmlns:cx1="http://schemas.microsoft.com/office/drawing/2015/9/8/chartex" xmlns:cx2="http://schemas.microsoft.com/office/drawing/2015/10/21/chartex" xmlns:cx3="http://schemas.microsoft.com/office/drawing/2016/5/9/chartex" xmlns:cx4="http://schemas.microsoft.com/office/drawing/2016/5/10/chartex" xmlns:cx5="http://schemas.microsoft.com/office/drawing/2016/5/11/chartex" xmlns:cx6="http://schemas.microsoft.com/office/drawing/2016/5/12/chartex" xmlns:cx7="http://schemas.microsoft.com/office/drawing/2016/5/13/chartex" xmlns:cx8="http://schemas.microsoft.com/office/drawing/2016/5/14/chartex" xmlns:mc="http://schemas.openxmlformats.org/markup-compatibility/2006" xmlns:aink="http://schemas.microsoft.com/office/drawing/2016/ink" xmlns:am3d="http://schemas.microsoft.com/office/drawing/2017/model3d" xmlns:o="urn:schemas-microsoft-com:office:office" xmlns:oel="http://schemas.microsoft.com/office/2019/extlst" xmlns:r="http://schemas.openxmlformats.org/officeDocument/2006/relationships" xmlns:m="http://schemas.openxmlformats.org/officeDocument/2006/math" xmlns:v="urn:schemas-microsoft-com:vml" xmlns:wp14="http://schemas.microsoft.com/office/word/2010/wordprocessingDrawing" xmlns:wp="http://schemas.openxmlformats.org/drawingml/2006/wordprocessingDrawing" xmlns:w10="urn:schemas-microsoft-com:office:word" xmlns:w="http://schemas.openxmlformats.org/wordprocessingml/2006/main" xmlns:w14="http://schemas.microsoft.com/office/word/2010/wordml" xmlns:w15="http://schemas.microsoft.com/office/word/2012/wordml" xmlns:w16cex="http://schemas.microsoft.com/office/word/2018/wordml/cex" xmlns:w16cid="http://schemas.microsoft.com/office/word/2016/wordml/cid" xmlns:w16="http://schemas.microsoft.com/office/word/2018/wordml" xmlns:w16du="http://schemas.microsoft.com/office/word/2023/wordml/word16du" xmlns:w16sdtdh="http://schemas.microsoft.com/office/word/2020/wordml/sdtdatahash" xmlns:w16sdtfl="http://schemas.microsoft.com/office/word/2024/wordml/sdtformatlock" xmlns:w16se="http://schemas.microsoft.com/office/word/2015/wordml/symex" xmlns:wpg="http://schemas.microsoft.com/office/word/2010/wordprocessingGroup" xmlns:wpi="http://schemas.microsoft.com/office/word/2010/wordprocessingInk" xmlns:wne="http://schemas.microsoft.com/office/word/2006/wordml" xmlns:wps="http://schemas.microsoft.com/office/word/2010/wordprocessingShape" mc:Ignorable="w14 w15 w16se w16cid w16 w16cex w16sdtdh w16sdtfl w16du wp14">
+  <w:footnote w:type="separator" w:id="-1">
+    <w:p>
+      <w:pPr>
+        <w:spacing w:after="0" w:line="240" w:lineRule="auto"/>
+      </w:pPr>
+      <w:r>
+        <w:separator/>
+      </w:r>
+    </w:p>
+  </w:footnote>
+  <w:footnote w:type="continuationSeparator" w:id="0">
+    <w:p>
+      <w:pPr>
+        <w:spacing w:after="0" w:line="240" w:lineRule="auto"/>
+      </w:pPr>
+      <w:r>
+        <w:continuationSeparator/>
+      </w:r>
+    </w:p>
+  </w:footnote>
+</w:footnotes>
+</file>
+
+<file path=word/header1.xml><?xml version="1.0" encoding="utf-8"?>
+<w:hdr xmlns:wpc="http://schemas.microsoft.com/office/word/2010/wordprocessingCanvas" xmlns:cx="http://schemas.microsoft.com/office/drawing/2014/chartex" xmlns:cx1="http://schemas.microsoft.com/office/drawing/2015/9/8/chartex" xmlns:cx2="http://schemas.microsoft.com/office/drawing/2015/10/21/chartex" xmlns:cx3="http://schemas.microsoft.com/office/drawing/2016/5/9/chartex" xmlns:cx4="http://schemas.microsoft.com/office/drawing/2016/5/10/chartex" xmlns:cx5="http://schemas.microsoft.com/office/drawing/2016/5/11/chartex" xmlns:cx6="http://schemas.microsoft.com/office/drawing/2016/5/12/chartex" xmlns:cx7="http://schemas.microsoft.com/office/drawing/2016/5/13/chartex" xmlns:cx8="http://schemas.microsoft.com/office/drawing/2016/5/14/chartex" xmlns:mc="http://schemas.openxmlformats.org/markup-compatibility/2006" xmlns:aink="http://schemas.microsoft.com/office/drawing/2016/ink" xmlns:am3d="http://schemas.microsoft.com/office/drawing/2017/model3d" xmlns:o="urn:schemas-microsoft-com:office:office" xmlns:oel="http://schemas.microsoft.com/office/2019/extlst" xmlns:r="http://schemas.openxmlformats.org/officeDocument/2006/relationships" xmlns:m="http://schemas.openxmlformats.org/officeDocument/2006/math" xmlns:v="urn:schemas-microsoft-com:vml" xmlns:wp14="http://schemas.microsoft.com/office/word/2010/wordprocessingDrawing" xmlns:wp="http://schemas.openxmlformats.org/drawingml/2006/wordprocessingDrawing" xmlns:w10="urn:schemas-microsoft-com:office:word" xmlns:w="http://schemas.openxmlformats.org/wordprocessingml/2006/main" xmlns:w14="http://schemas.microsoft.com/office/word/2010/wordml" xmlns:w15="http://schemas.microsoft.com/office/word/2012/wordml" xmlns:w16cex="http://schemas.microsoft.com/office/word/2018/wordml/cex" xmlns:w16cid="http://schemas.microsoft.com/office/word/2016/wordml/cid" xmlns:w16="http://schemas.microsoft.com/office/word/2018/wordml" xmlns:w16du="http://schemas.microsoft.com/office/word/2023/wordml/word16du" xmlns:w16sdtdh="http://schemas.microsoft.com/office/word/2020/wordml/sdtdatahash" xmlns:w16sdtfl="http://schemas.microsoft.com/office/word/2024/wordml/sdtformatlock" xmlns:w16se="http://schemas.microsoft.com/office/word/2015/wordml/symex" xmlns:wpg="http://schemas.microsoft.com/office/word/2010/wordprocessingGroup" xmlns:wpi="http://schemas.microsoft.com/office/word/2010/wordprocessingInk" xmlns:wne="http://schemas.microsoft.com/office/word/2006/wordml" xmlns:wps="http://schemas.microsoft.com/office/word/2010/wordprocessingShape" mc:Ignorable="w14 w15 w16se w16cid w16 w16cex w16sdtdh w16sdtfl w16du wp14">
+  <w:p>
+    <w:pPr>
+      <w:pStyle w:val="Sidhuvud"/>
+    </w:pPr>
+  </w:p>
+</w:hdr>
+</file>
+
+<file path=word/header2.xml><?xml version="1.0" encoding="utf-8"?>
+<w:hdr xmlns:wpc="http://schemas.microsoft.com/office/word/2010/wordprocessingCanvas" xmlns:cx="http://schemas.microsoft.com/office/drawing/2014/chartex" xmlns:cx1="http://schemas.microsoft.com/office/drawing/2015/9/8/chartex" xmlns:cx2="http://schemas.microsoft.com/office/drawing/2015/10/21/chartex" xmlns:cx3="http://schemas.microsoft.com/office/drawing/2016/5/9/chartex" xmlns:cx4="http://schemas.microsoft.com/office/drawing/2016/5/10/chartex" xmlns:cx5="http://schemas.microsoft.com/office/drawing/2016/5/11/chartex" xmlns:cx6="http://schemas.microsoft.com/office/drawing/2016/5/12/chartex" xmlns:cx7="http://schemas.microsoft.com/office/drawing/2016/5/13/chartex" xmlns:cx8="http://schemas.microsoft.com/office/drawing/2016/5/14/chartex" xmlns:mc="http://schemas.openxmlformats.org/markup-compatibility/2006" xmlns:aink="http://schemas.microsoft.com/office/drawing/2016/ink" xmlns:am3d="http://schemas.microsoft.com/office/drawing/2017/model3d" xmlns:o="urn:schemas-microsoft-com:office:office" xmlns:oel="http://schemas.microsoft.com/office/2019/extlst" xmlns:r="http://schemas.openxmlformats.org/officeDocument/2006/relationships" xmlns:m="http://schemas.openxmlformats.org/officeDocument/2006/math" xmlns:v="urn:schemas-microsoft-com:vml" xmlns:wp14="http://schemas.microsoft.com/office/word/2010/wordprocessingDrawing" xmlns:wp="http://schemas.openxmlformats.org/drawingml/2006/wordprocessingDrawing" xmlns:w10="urn:schemas-microsoft-com:office:word" xmlns:w="http://schemas.openxmlformats.org/wordprocessingml/2006/main" xmlns:w14="http://schemas.microsoft.com/office/word/2010/wordml" xmlns:w15="http://schemas.microsoft.com/office/word/2012/wordml" xmlns:w16cex="http://schemas.microsoft.com/office/word/2018/wordml/cex" xmlns:w16cid="http://schemas.microsoft.com/office/word/2016/wordml/cid" xmlns:w16="http://schemas.microsoft.com/office/word/2018/wordml" xmlns:w16du="http://schemas.microsoft.com/office/word/2023/wordml/word16du" xmlns:w16sdtdh="http://schemas.microsoft.com/office/word/2020/wordml/sdtdatahash" xmlns:w16sdtfl="http://schemas.microsoft.com/office/word/2024/wordml/sdtformatlock" xmlns:w16se="http://schemas.microsoft.com/office/word/2015/wordml/symex" xmlns:wpg="http://schemas.microsoft.com/office/word/2010/wordprocessingGroup" xmlns:wpi="http://schemas.microsoft.com/office/word/2010/wordprocessingInk" xmlns:wne="http://schemas.microsoft.com/office/word/2006/wordml" xmlns:wps="http://schemas.microsoft.com/office/word/2010/wordprocessingShape" mc:Ignorable="w14 w15 w16se w16cid w16 w16cex w16sdtdh w16sdtfl w16du wp14">
+  <w:p>
+    <w:pPr>
+      <w:pStyle w:val="Sidhuvud"/>
+    </w:pPr>
+  </w:p>
+</w:hdr>
+</file>
+
+<file path=word/header3.xml><?xml version="1.0" encoding="utf-8"?>
+<w:hdr xmlns:wpc="http://schemas.microsoft.com/office/word/2010/wordprocessingCanvas" xmlns:cx="http://schemas.microsoft.com/office/drawing/2014/chartex" xmlns:cx1="http://schemas.microsoft.com/office/drawing/2015/9/8/chartex" xmlns:cx2="http://schemas.microsoft.com/office/drawing/2015/10/21/chartex" xmlns:cx3="http://schemas.microsoft.com/office/drawing/2016/5/9/chartex" xmlns:cx4="http://schemas.microsoft.com/office/drawing/2016/5/10/chartex" xmlns:cx5="http://schemas.microsoft.com/office/drawing/2016/5/11/chartex" xmlns:cx6="http://schemas.microsoft.com/office/drawing/2016/5/12/chartex" xmlns:cx7="http://schemas.microsoft.com/office/drawing/2016/5/13/chartex" xmlns:cx8="http://schemas.microsoft.com/office/drawing/2016/5/14/chartex" xmlns:mc="http://schemas.openxmlformats.org/markup-compatibility/2006" xmlns:aink="http://schemas.microsoft.com/office/drawing/2016/ink" xmlns:am3d="http://schemas.microsoft.com/office/drawing/2017/model3d" xmlns:o="urn:schemas-microsoft-com:office:office" xmlns:oel="http://schemas.microsoft.com/office/2019/extlst" xmlns:r="http://schemas.openxmlformats.org/officeDocument/2006/relationships" xmlns:m="http://schemas.openxmlformats.org/officeDocument/2006/math" xmlns:v="urn:schemas-microsoft-com:vml" xmlns:wp14="http://schemas.microsoft.com/office/word/2010/wordprocessingDrawing" xmlns:wp="http://schemas.openxmlformats.org/drawingml/2006/wordprocessingDrawing" xmlns:w10="urn:schemas-microsoft-com:office:word" xmlns:w="http://schemas.openxmlformats.org/wordprocessingml/2006/main" xmlns:w14="http://schemas.microsoft.com/office/word/2010/wordml" xmlns:w15="http://schemas.microsoft.com/office/word/2012/wordml" xmlns:w16cex="http://schemas.microsoft.com/office/word/2018/wordml/cex" xmlns:w16cid="http://schemas.microsoft.com/office/word/2016/wordml/cid" xmlns:w16="http://schemas.microsoft.com/office/word/2018/wordml" xmlns:w16du="http://schemas.microsoft.com/office/word/2023/wordml/word16du" xmlns:w16sdtdh="http://schemas.microsoft.com/office/word/2020/wordml/sdtdatahash" xmlns:w16sdtfl="http://schemas.microsoft.com/office/word/2024/wordml/sdtformatlock" xmlns:w16se="http://schemas.microsoft.com/office/word/2015/wordml/symex" xmlns:wpg="http://schemas.microsoft.com/office/word/2010/wordprocessingGroup" xmlns:wpi="http://schemas.microsoft.com/office/word/2010/wordprocessingInk" xmlns:wne="http://schemas.microsoft.com/office/word/2006/wordml" xmlns:wps="http://schemas.microsoft.com/office/word/2010/wordprocessingShape" mc:Ignorable="w14 w15 w16se w16cid w16 w16cex w16sdtdh w16sdtfl w16du wp14">
+  <w:p>
+    <w:pPr>
+      <w:pStyle w:val="Sidhuvud"/>
+    </w:pPr>
+  </w:p>
+</w:hdr>
 </file>
 
 <file path=word/numbering.xml><?xml version="1.0" encoding="utf-8"?>
@@ -9161,6 +9352,62 @@
       <w:shd w:val="clear" w:color="auto" w:fill="E1DFDD"/>
     </w:rPr>
   </w:style>
+  <w:style w:type="character" w:styleId="AnvndHyperlnk">
+    <w:name w:val="FollowedHyperlink"/>
+    <w:basedOn w:val="Standardstycketeckensnitt"/>
+    <w:uiPriority w:val="99"/>
+    <w:semiHidden/>
+    <w:unhideWhenUsed/>
+    <w:rsid w:val="004676E8"/>
+    <w:rPr>
+      <w:color w:val="954F72" w:themeColor="followedHyperlink"/>
+      <w:u w:val="single"/>
+    </w:rPr>
+  </w:style>
+  <w:style w:type="paragraph" w:styleId="Sidhuvud">
+    <w:name w:val="header"/>
+    <w:basedOn w:val="Normal"/>
+    <w:link w:val="SidhuvudChar"/>
+    <w:uiPriority w:val="99"/>
+    <w:unhideWhenUsed/>
+    <w:rsid w:val="004676E8"/>
+    <w:pPr>
+      <w:tabs>
+        <w:tab w:val="center" w:pos="4536"/>
+        <w:tab w:val="right" w:pos="9072"/>
+      </w:tabs>
+      <w:spacing w:after="0" w:line="240" w:lineRule="auto"/>
+    </w:pPr>
+  </w:style>
+  <w:style w:type="character" w:customStyle="1" w:styleId="SidhuvudChar">
+    <w:name w:val="Sidhuvud Char"/>
+    <w:basedOn w:val="Standardstycketeckensnitt"/>
+    <w:link w:val="Sidhuvud"/>
+    <w:uiPriority w:val="99"/>
+    <w:rsid w:val="004676E8"/>
+  </w:style>
+  <w:style w:type="paragraph" w:styleId="Sidfot">
+    <w:name w:val="footer"/>
+    <w:basedOn w:val="Normal"/>
+    <w:link w:val="SidfotChar"/>
+    <w:uiPriority w:val="99"/>
+    <w:unhideWhenUsed/>
+    <w:rsid w:val="004676E8"/>
+    <w:pPr>
+      <w:tabs>
+        <w:tab w:val="center" w:pos="4536"/>
+        <w:tab w:val="right" w:pos="9072"/>
+      </w:tabs>
+      <w:spacing w:after="0" w:line="240" w:lineRule="auto"/>
+    </w:pPr>
+  </w:style>
+  <w:style w:type="character" w:customStyle="1" w:styleId="SidfotChar">
+    <w:name w:val="Sidfot Char"/>
+    <w:basedOn w:val="Standardstycketeckensnitt"/>
+    <w:link w:val="Sidfot"/>
+    <w:uiPriority w:val="99"/>
+    <w:rsid w:val="004676E8"/>
+  </w:style>
 </w:styles>
 </file>
 

</xml_diff>